<commit_message>
Update experience dates and CV
Co-Authored-By: Claude Sonnet 5.5 <noreply@anthropic.com>
</commit_message>
<xml_diff>
--- a/Harshana_Karunarathne_CV.docx
+++ b/Harshana_Karunarathne_CV.docx
@@ -45,7 +45,7 @@
         <w:jc w:val="center"/>
       </w:pPr>
       <w:r>
-        <w:t>linkedin.com/in/harshana-karunarathne2 | github.com/Harshana2</w:t>
+        <w:t>linkedin.com/in/harshana-karunarathne2 | github.com/Harshana2 | harshana2.github.io/portfolio</w:t>
       </w:r>
     </w:p>
     <w:p>
@@ -71,10 +71,10 @@
         <w:spacing w:after="60"/>
       </w:pPr>
       <w:r>
-        <w:t xml:space="preserve">Full-stack Software Engineer with 1.5+ years of experience designing and delivering enterprise-grade applications with Java, Spring Boot and React. Builds scalable, secure systems end to end, from microservices and REST APIs to event-driven architectures with Apache Kafka, real-time messaging and AI integrations, deployed with Docker on AWS. Experienced in banking and payment systems, multi-tenant platforms, role-based security, audit compliance and modernizing legacy Java applications. First Class Honours </w:t>
-      </w:r>
-      <w:r>
-        <w:t>graduate in Statistics and Computer Science.</w:t>
+        <w:t xml:space="preserve">Full-stack Software Engineer with 2+ years of experience designing and delivering enterprise-grade applications with Java, Spring Boot and React. Builds scalable, secure systems end to end, from microservices and REST APIs to event-driven architectures with Apache Kafka, real-time messaging and AI integrations, deployed with Docker on AWS. Experienced in banking and payment systems, multi-tenant platforms, role-based security, audit compliance and modernizing legacy Java applications. </w:t>
+      </w:r>
+      <w:r>
+        <w:t>Graduate in Statistics and Computer Science.</w:t>
       </w:r>
     </w:p>
     <w:p>
@@ -254,7 +254,7 @@
           <w:bCs/>
         </w:rPr>
         <w:tab/>
-        <w:t>Sep 2025 – Present</w:t>
+        <w:t>Sep 2024 – Present</w:t>
       </w:r>
     </w:p>
     <w:p>
@@ -343,7 +343,7 @@
           <w:bCs/>
         </w:rPr>
         <w:tab/>
-        <w:t>Feb 2025 – Aug 2025</w:t>
+        <w:t>Feb 2024 – Sep 2024</w:t>
       </w:r>
     </w:p>
     <w:p>
@@ -714,7 +714,7 @@
           <w:b/>
           <w:bCs/>
         </w:rPr>
-        <w:t>B.Sc. in Physical Science (Statistics and Computer Science), First Class Honours</w:t>
+        <w:t>B.Sc. in Physical Science (Statistics and Computer Science)</w:t>
       </w:r>
       <w:r>
         <w:rPr>

</xml_diff>